<commit_message>
Add placeholders to official F51 template
Co-authored-by: kaymax239 <kaymax239@users.noreply.github.com>
</commit_message>
<xml_diff>
--- a/planeaciones-nautica/public/templates/Avance-Programatico-F51.docx
+++ b/planeaciones-nautica/public/templates/Avance-Programatico-F51.docx
@@ -632,7 +632,7 @@
               <w:rPr>
                 <w:sz w:val="18"/>
               </w:rPr>
-              <w:t xml:space="preserve">{temasSubtemasCubiertos}</w:t>
+              <w:t xml:space="preserve">{temasCubiertos}</w:t>
             </w:r>
           </w:p>
         </w:tc>
@@ -831,7 +831,7 @@
               <w:rPr>
                 <w:sz w:val="18"/>
               </w:rPr>
-              <w:t xml:space="preserve">{semana1Tema}</w:t>
+              <w:t xml:space="preserve">{tema1}</w:t>
             </w:r>
           </w:p>
         </w:tc>
@@ -849,7 +849,7 @@
               <w:rPr>
                 <w:sz w:val="18"/>
               </w:rPr>
-              <w:t xml:space="preserve">{semana1Sesiones}</w:t>
+              <w:t xml:space="preserve">{sesiones1}</w:t>
             </w:r>
           </w:p>
         </w:tc>
@@ -866,7 +866,7 @@
               <w:rPr>
                 <w:sz w:val="18"/>
               </w:rPr>
-              <w:t xml:space="preserve">Realizado conforme a planeacion SIGAA</w:t>
+              <w:t xml:space="preserve">Estrategia: {estrategia1} | Evidencia: {evidencia1} | Recursos: {recursos1} | Instrumento: {instrumento1}</w:t>
             </w:r>
           </w:p>
         </w:tc>
@@ -904,7 +904,7 @@
               <w:rPr>
                 <w:sz w:val="18"/>
               </w:rPr>
-              <w:t xml:space="preserve">{semana2Tema}</w:t>
+              <w:t xml:space="preserve">{tema2}</w:t>
             </w:r>
           </w:p>
         </w:tc>
@@ -922,7 +922,7 @@
               <w:rPr>
                 <w:sz w:val="18"/>
               </w:rPr>
-              <w:t xml:space="preserve">{semana2Sesiones}</w:t>
+              <w:t xml:space="preserve">{sesiones2}</w:t>
             </w:r>
           </w:p>
         </w:tc>
@@ -939,7 +939,7 @@
               <w:rPr>
                 <w:sz w:val="18"/>
               </w:rPr>
-              <w:t xml:space="preserve">Realizado conforme a planeacion SIGAA</w:t>
+              <w:t xml:space="preserve">Estrategia: {estrategia2} | Evidencia: {evidencia2} | Recursos: {recursos2} | Instrumento: {instrumento2}</w:t>
             </w:r>
           </w:p>
         </w:tc>
@@ -977,7 +977,7 @@
               <w:rPr>
                 <w:sz w:val="18"/>
               </w:rPr>
-              <w:t xml:space="preserve">{semana3Tema}</w:t>
+              <w:t xml:space="preserve">{tema3}</w:t>
             </w:r>
           </w:p>
         </w:tc>
@@ -995,7 +995,7 @@
               <w:rPr>
                 <w:sz w:val="18"/>
               </w:rPr>
-              <w:t xml:space="preserve">{semana3Sesiones}</w:t>
+              <w:t xml:space="preserve">{sesiones3}</w:t>
             </w:r>
           </w:p>
         </w:tc>
@@ -1012,7 +1012,7 @@
               <w:rPr>
                 <w:sz w:val="18"/>
               </w:rPr>
-              <w:t xml:space="preserve">Realizado conforme a planeacion SIGAA</w:t>
+              <w:t xml:space="preserve">Estrategia: {estrategia3} | Evidencia: {evidencia3} | Recursos: {recursos3} | Instrumento: {instrumento3}</w:t>
             </w:r>
           </w:p>
         </w:tc>
@@ -1050,7 +1050,7 @@
               <w:rPr>
                 <w:sz w:val="18"/>
               </w:rPr>
-              <w:t xml:space="preserve">{semana4Tema}</w:t>
+              <w:t xml:space="preserve">{tema4}</w:t>
             </w:r>
           </w:p>
         </w:tc>
@@ -1068,7 +1068,7 @@
               <w:rPr>
                 <w:sz w:val="18"/>
               </w:rPr>
-              <w:t xml:space="preserve">{semana4Sesiones}</w:t>
+              <w:t xml:space="preserve">{sesiones4}</w:t>
             </w:r>
           </w:p>
         </w:tc>
@@ -1085,7 +1085,7 @@
               <w:rPr>
                 <w:sz w:val="18"/>
               </w:rPr>
-              <w:t xml:space="preserve">Realizado conforme a planeacion SIGAA</w:t>
+              <w:t xml:space="preserve">Estrategia: {estrategia4} | Evidencia: {evidencia4} | Recursos: {recursos4} | Instrumento: {instrumento4}</w:t>
             </w:r>
           </w:p>
         </w:tc>
@@ -1427,7 +1427,7 @@
               <w:rPr>
                 <w:sz w:val="18"/>
               </w:rPr>
-              <w:t xml:space="preserve">El avance corresponde a los temas programados en el periodo reportado y se documenta para seguimiento institucional.</w:t>
+              <w:t xml:space="preserve">{razonesNoCumplio}</w:t>
             </w:r>
           </w:p>
         </w:tc>
@@ -1529,7 +1529,7 @@
               <w:rPr>
                 <w:sz w:val="18"/>
               </w:rPr>
-              <w:t xml:space="preserve">{nombreFirmaDocente}</w:t>
+              <w:t xml:space="preserve">{firmaDocente}</w:t>
             </w:r>
           </w:p>
         </w:tc>

</xml_diff>